<commit_message>
Finished my first draft
</commit_message>
<xml_diff>
--- a/Product_Output/Project_Writeup.docx
+++ b/Product_Output/Project_Writeup.docx
@@ -65,13 +65,21 @@
         <w:br w:type="page"/>
       </w:r>
     </w:p>
-    <w:bookmarkStart w:id="22" w:name="Xe9a036b7bd22362b36dfde584c7697bfded04df"/>
+    <w:bookmarkStart w:id="20" w:name="overview"/>
     <w:p>
       <w:pPr>
         <w:pStyle w:val="Heading1"/>
       </w:pPr>
       <w:r>
-        <w:t xml:space="preserve">Skipjack Science Lifting the Pacific Region’s Economic Ceiling</w:t>
+        <w:t xml:space="preserve">Overview</w:t>
+      </w:r>
+    </w:p>
+    <w:p>
+      <w:pPr>
+        <w:pStyle w:val="FirstParagraph"/>
+      </w:pPr>
+      <w:r>
+        <w:t xml:space="preserve">the P</w:t>
       </w:r>
     </w:p>
     <w:p>
@@ -79,26 +87,36 @@
         <w:br w:type="page"/>
       </w:r>
     </w:p>
-    <w:bookmarkStart w:id="21" w:name="X3c5627283f59d4c6506f756c591a9d96509e861"/>
+    <w:bookmarkEnd w:id="20"/>
+    <w:bookmarkStart w:id="21" w:name="findings"/>
     <w:p>
       <w:pPr>
-        <w:pStyle w:val="Heading2"/>
+        <w:pStyle w:val="Heading1"/>
       </w:pPr>
       <w:r>
-        <w:t xml:space="preserve">Skipjack Science Lifting the Pacific Region’s Economic Ceiling</w:t>
+        <w:t xml:space="preserve">Findings</w:t>
       </w:r>
     </w:p>
-    <w:bookmarkStart w:id="20" w:name="Xed6df0cba5abf07e4defce4a7c12671e0637865"/>
     <w:p>
-      <w:pPr>
-        <w:pStyle w:val="Heading3"/>
-      </w:pPr>
       <w:r>
-        <w:t xml:space="preserve">Skipjack Science Lifting the Pacific Region’s Economic Ceiling</w:t>
+        <w:br w:type="page"/>
       </w:r>
     </w:p>
-    <w:bookmarkEnd w:id="20"/>
     <w:bookmarkEnd w:id="21"/>
+    <w:bookmarkStart w:id="22" w:name="recommendations"/>
+    <w:p>
+      <w:pPr>
+        <w:pStyle w:val="Heading1"/>
+      </w:pPr>
+      <w:r>
+        <w:t xml:space="preserve">Recommendations</w:t>
+      </w:r>
+    </w:p>
+    <w:p>
+      <w:r>
+        <w:br w:type="page"/>
+      </w:r>
+    </w:p>
     <w:bookmarkEnd w:id="22"/>
     <w:bookmarkStart w:id="23" w:name="references"/>
     <w:p>
@@ -294,7 +312,7 @@
         <w:noProof/>
       </w:rPr>
       <w:drawing>
-        <wp:anchor distT="0" distB="0" distL="114300" distR="114300" simplePos="0" relativeHeight="251656704" behindDoc="0" locked="0" layoutInCell="1" allowOverlap="1" wp14:anchorId="1B71EE69" wp14:editId="52B822B2">
+        <wp:anchor distT="0" distB="0" distL="114300" distR="114300" simplePos="0" relativeHeight="251657216" behindDoc="0" locked="0" layoutInCell="1" allowOverlap="1" wp14:anchorId="1B71EE69" wp14:editId="52B822B2">
           <wp:simplePos x="0" y="0"/>
           <wp:positionH relativeFrom="column">
             <wp:posOffset>-1123950</wp:posOffset>
@@ -368,6 +386,10 @@
         <w:r>
           <w:rPr>
             <w:rStyle w:val="PlaceholderText"/>
+            <w:i/>
+            <w:iCs/>
+            <w:sz w:val="20"/>
+            <w:szCs w:val="22"/>
           </w:rPr>
           <w:t>[Title]</w:t>
         </w:r>
@@ -410,6 +432,10 @@
         <w:r>
           <w:rPr>
             <w:rStyle w:val="PlaceholderText"/>
+            <w:i/>
+            <w:iCs/>
+            <w:sz w:val="20"/>
+            <w:szCs w:val="22"/>
           </w:rPr>
           <w:t>[Title]</w:t>
         </w:r>
@@ -426,7 +452,7 @@
         <w:noProof/>
       </w:rPr>
       <w:drawing>
-        <wp:anchor distT="0" distB="0" distL="114300" distR="114300" simplePos="0" relativeHeight="251658240" behindDoc="0" locked="0" layoutInCell="1" allowOverlap="1" wp14:anchorId="2FFC31E3" wp14:editId="639A1CFD">
+        <wp:anchor distT="0" distB="0" distL="114300" distR="114300" simplePos="0" relativeHeight="251659264" behindDoc="0" locked="0" layoutInCell="1" allowOverlap="1" wp14:anchorId="2FFC31E3" wp14:editId="639A1CFD">
           <wp:simplePos x="0" y="0"/>
           <wp:positionH relativeFrom="column">
             <wp:posOffset>-1142431</wp:posOffset>

</xml_diff>